<commit_message>
I made some changes in the html, I added other image of the logo,  and I completed de css codes of each html.
</commit_message>
<xml_diff>
--- a/content-checker-site-plan-template.docx
+++ b/content-checker-site-plan-template.docx
@@ -423,6 +423,7 @@
         <w:rPr>
           <w:rFonts w:eastAsia="Times New Roman"/>
         </w:rPr>
+        <w:lastRenderedPageBreak/>
         <w:t>Style Guide</w:t>
       </w:r>
     </w:p>
@@ -1204,7 +1205,6 @@
     </w:p>
     <w:p>
       <w:r>
-        <w:lastRenderedPageBreak/>
         <w:tab/>
         <w:t xml:space="preserve">Photo of me with </w:t>
       </w:r>
@@ -1310,7 +1310,11 @@
         <w:t xml:space="preserve"> time</w:t>
       </w:r>
       <w:r>
-        <w:t xml:space="preserve">, especially </w:t>
+        <w:t xml:space="preserve">, </w:t>
+      </w:r>
+      <w:r>
+        <w:lastRenderedPageBreak/>
+        <w:t xml:space="preserve">especially </w:t>
       </w:r>
       <w:r>
         <w:t>parents</w:t>
@@ -1464,6 +1468,7 @@
       <w:r>
         <w:rPr>
           <w:rFonts w:eastAsia="Times New Roman"/>
+          <w:noProof/>
         </w:rPr>
         <w:drawing>
           <wp:anchor distT="0" distB="0" distL="114300" distR="114300" simplePos="0" relativeHeight="251661312" behindDoc="1" locked="0" layoutInCell="1" allowOverlap="1" wp14:anchorId="7D84565B" wp14:editId="60E850AD">
@@ -1547,21 +1552,22 @@
       <w:r>
         <w:rPr>
           <w:rFonts w:eastAsia="Times New Roman"/>
+          <w:noProof/>
         </w:rPr>
         <w:lastRenderedPageBreak/>
         <w:drawing>
-          <wp:anchor distT="0" distB="0" distL="114300" distR="114300" simplePos="0" relativeHeight="251662336" behindDoc="0" locked="0" layoutInCell="1" allowOverlap="1" wp14:anchorId="1905C51F" wp14:editId="376AD2ED">
+          <wp:anchor distT="0" distB="0" distL="114300" distR="114300" simplePos="0" relativeHeight="251663360" behindDoc="0" locked="0" layoutInCell="1" allowOverlap="1" wp14:anchorId="791B49DD" wp14:editId="3989DDA2">
             <wp:simplePos x="0" y="0"/>
             <wp:positionH relativeFrom="margin">
-              <wp:align>center</wp:align>
+              <wp:posOffset>532663</wp:posOffset>
             </wp:positionH>
             <wp:positionV relativeFrom="paragraph">
-              <wp:posOffset>-548005</wp:posOffset>
+              <wp:posOffset>4603484</wp:posOffset>
             </wp:positionV>
-            <wp:extent cx="5128260" cy="5016414"/>
+            <wp:extent cx="4922520" cy="4370858"/>
             <wp:effectExtent l="0" t="0" r="0" b="0"/>
             <wp:wrapNone/>
-            <wp:docPr id="632679496" name="Picture 1"/>
+            <wp:docPr id="1588087146" name="Picture 1"/>
             <wp:cNvGraphicFramePr>
               <a:graphicFrameLocks xmlns:a="http://schemas.openxmlformats.org/drawingml/2006/main" noChangeAspect="1"/>
             </wp:cNvGraphicFramePr>
@@ -1569,7 +1575,7 @@
               <a:graphicData uri="http://schemas.openxmlformats.org/drawingml/2006/picture">
                 <pic:pic xmlns:pic="http://schemas.openxmlformats.org/drawingml/2006/picture">
                   <pic:nvPicPr>
-                    <pic:cNvPr id="632679496" name=""/>
+                    <pic:cNvPr id="1588087146" name=""/>
                     <pic:cNvPicPr/>
                   </pic:nvPicPr>
                   <pic:blipFill rotWithShape="1">
@@ -1580,7 +1586,7 @@
                         </a:ext>
                       </a:extLst>
                     </a:blip>
-                    <a:srcRect l="27436" t="18098" r="28077"/>
+                    <a:srcRect l="27436" t="24131" r="27949" b="1307"/>
                     <a:stretch>
                       <a:fillRect/>
                     </a:stretch>
@@ -1588,7 +1594,7 @@
                   <pic:spPr bwMode="auto">
                     <a:xfrm>
                       <a:off x="0" y="0"/>
-                      <a:ext cx="5128260" cy="5016414"/>
+                      <a:ext cx="4922520" cy="4370858"/>
                     </a:xfrm>
                     <a:prstGeom prst="rect">
                       <a:avLst/>
@@ -1617,20 +1623,21 @@
       <w:r>
         <w:rPr>
           <w:rFonts w:eastAsia="Times New Roman"/>
+          <w:noProof/>
         </w:rPr>
         <w:drawing>
-          <wp:anchor distT="0" distB="0" distL="114300" distR="114300" simplePos="0" relativeHeight="251663360" behindDoc="0" locked="0" layoutInCell="1" allowOverlap="1" wp14:anchorId="791B49DD" wp14:editId="4B4684FA">
+          <wp:anchor distT="0" distB="0" distL="114300" distR="114300" simplePos="0" relativeHeight="251662336" behindDoc="0" locked="0" layoutInCell="1" allowOverlap="1" wp14:anchorId="1905C51F" wp14:editId="245F0137">
             <wp:simplePos x="0" y="0"/>
             <wp:positionH relativeFrom="margin">
               <wp:align>center</wp:align>
             </wp:positionH>
             <wp:positionV relativeFrom="paragraph">
-              <wp:posOffset>4500245</wp:posOffset>
+              <wp:posOffset>-548005</wp:posOffset>
             </wp:positionV>
-            <wp:extent cx="4922520" cy="4370858"/>
+            <wp:extent cx="5128260" cy="5016414"/>
             <wp:effectExtent l="0" t="0" r="0" b="0"/>
             <wp:wrapNone/>
-            <wp:docPr id="1588087146" name="Picture 1"/>
+            <wp:docPr id="632679496" name="Picture 1"/>
             <wp:cNvGraphicFramePr>
               <a:graphicFrameLocks xmlns:a="http://schemas.openxmlformats.org/drawingml/2006/main" noChangeAspect="1"/>
             </wp:cNvGraphicFramePr>
@@ -1638,7 +1645,7 @@
               <a:graphicData uri="http://schemas.openxmlformats.org/drawingml/2006/picture">
                 <pic:pic xmlns:pic="http://schemas.openxmlformats.org/drawingml/2006/picture">
                   <pic:nvPicPr>
-                    <pic:cNvPr id="1588087146" name=""/>
+                    <pic:cNvPr id="632679496" name=""/>
                     <pic:cNvPicPr/>
                   </pic:nvPicPr>
                   <pic:blipFill rotWithShape="1">
@@ -1649,7 +1656,7 @@
                         </a:ext>
                       </a:extLst>
                     </a:blip>
-                    <a:srcRect l="27436" t="24131" r="27949" b="1307"/>
+                    <a:srcRect l="27436" t="18098" r="28077"/>
                     <a:stretch>
                       <a:fillRect/>
                     </a:stretch>
@@ -1657,7 +1664,7 @@
                   <pic:spPr bwMode="auto">
                     <a:xfrm>
                       <a:off x="0" y="0"/>
-                      <a:ext cx="4922520" cy="4370858"/>
+                      <a:ext cx="5128260" cy="5016414"/>
                     </a:xfrm>
                     <a:prstGeom prst="rect">
                       <a:avLst/>

</xml_diff>